<commit_message>
add project delivery day
</commit_message>
<xml_diff>
--- a/1481/Projeto/Projecto Chat.docx
+++ b/1481/Projeto/Projecto Chat.docx
@@ -1174,7 +1174,6 @@
         </w:rPr>
         <w:t xml:space="preserve"> </w:t>
       </w:r>
-      <w:proofErr w:type="gramStart"/>
       <w:r>
         <w:rPr>
           <w:rFonts w:ascii="Times New Roman" w:eastAsia="Times New Roman" w:hAnsi="Times New Roman" w:cs="Times New Roman"/>
@@ -1206,9 +1205,8 @@
           <w:szCs w:val="24"/>
           <w:lang w:val="pt-PT" w:eastAsia="en-GB"/>
         </w:rPr>
-        <w:t>Interface</w:t>
-      </w:r>
-      <w:proofErr w:type="gramEnd"/>
+        <w:t xml:space="preserve">Interface Gráfica </w:t>
+      </w:r>
       <w:r>
         <w:rPr>
           <w:rFonts w:ascii="Times New Roman" w:eastAsia="Times New Roman" w:hAnsi="Times New Roman" w:cs="Times New Roman"/>
@@ -1218,7 +1216,7 @@
           <w:szCs w:val="24"/>
           <w:lang w:val="pt-PT" w:eastAsia="en-GB"/>
         </w:rPr>
-        <w:t xml:space="preserve"> Gráfica </w:t>
+        <w:t>é opcional</w:t>
       </w:r>
       <w:r>
         <w:rPr>
@@ -1229,9 +1227,8 @@
           <w:szCs w:val="24"/>
           <w:lang w:val="pt-PT" w:eastAsia="en-GB"/>
         </w:rPr>
-        <w:t xml:space="preserve">é </w:t>
-      </w:r>
-      <w:proofErr w:type="gramStart"/>
+        <w:t xml:space="preserve"> </w:t>
+      </w:r>
       <w:r>
         <w:rPr>
           <w:rFonts w:ascii="Times New Roman" w:eastAsia="Times New Roman" w:hAnsi="Times New Roman" w:cs="Times New Roman"/>
@@ -1241,31 +1238,8 @@
           <w:szCs w:val="24"/>
           <w:lang w:val="pt-PT" w:eastAsia="en-GB"/>
         </w:rPr>
-        <w:t>opcional</w:t>
-      </w:r>
-      <w:r>
-        <w:rPr>
-          <w:rFonts w:ascii="Times New Roman" w:eastAsia="Times New Roman" w:hAnsi="Times New Roman" w:cs="Times New Roman"/>
-          <w:b/>
-          <w:bCs/>
-          <w:sz w:val="24"/>
-          <w:szCs w:val="24"/>
-          <w:lang w:val="pt-PT" w:eastAsia="en-GB"/>
-        </w:rPr>
-        <w:t xml:space="preserve"> </w:t>
-      </w:r>
-      <w:r>
-        <w:rPr>
-          <w:rFonts w:ascii="Times New Roman" w:eastAsia="Times New Roman" w:hAnsi="Times New Roman" w:cs="Times New Roman"/>
-          <w:b/>
-          <w:bCs/>
-          <w:sz w:val="24"/>
-          <w:szCs w:val="24"/>
-          <w:lang w:val="pt-PT" w:eastAsia="en-GB"/>
-        </w:rPr>
         <w:t>)</w:t>
       </w:r>
-      <w:proofErr w:type="gramEnd"/>
       <w:r>
         <w:rPr>
           <w:rFonts w:ascii="Times New Roman" w:eastAsia="Times New Roman" w:hAnsi="Times New Roman" w:cs="Times New Roman"/>
@@ -4376,6 +4350,51 @@
           <w:lang w:val="pt-PT" w:eastAsia="en-GB"/>
         </w:rPr>
         <w:t>HUB</w:t>
+      </w:r>
+    </w:p>
+    <w:p>
+      <w:pPr>
+        <w:numPr>
+          <w:ilvl w:val="0"/>
+          <w:numId w:val="36"/>
+        </w:numPr>
+        <w:spacing w:before="100" w:beforeAutospacing="1" w:after="100" w:afterAutospacing="1" w:line="240" w:lineRule="auto"/>
+        <w:rPr>
+          <w:rFonts w:ascii="Times New Roman" w:eastAsia="Times New Roman" w:hAnsi="Times New Roman" w:cs="Times New Roman"/>
+          <w:sz w:val="24"/>
+          <w:szCs w:val="24"/>
+          <w:lang w:val="pt-PT" w:eastAsia="en-GB"/>
+        </w:rPr>
+      </w:pPr>
+      <w:r>
+        <w:rPr>
+          <w:rFonts w:ascii="Times New Roman" w:eastAsia="Times New Roman" w:hAnsi="Times New Roman" w:cs="Times New Roman"/>
+          <w:sz w:val="24"/>
+          <w:szCs w:val="24"/>
+          <w:lang w:val="pt-PT" w:eastAsia="en-GB"/>
+        </w:rPr>
+        <w:t xml:space="preserve">Entrega de projeto a dia 15 de Março com relatório para o meu email </w:t>
+      </w:r>
+      <w:hyperlink r:id="rId5" w:history="1">
+        <w:r>
+          <w:rPr>
+            <w:rStyle w:val="Hiperligao"/>
+            <w:rFonts w:ascii="Times New Roman" w:eastAsia="Times New Roman" w:hAnsi="Times New Roman" w:cs="Times New Roman"/>
+            <w:sz w:val="24"/>
+            <w:szCs w:val="24"/>
+            <w:lang w:val="pt-PT" w:eastAsia="en-GB"/>
+          </w:rPr>
+          <w:t>dario.quental.000606@edu.atec.pt</w:t>
+        </w:r>
+      </w:hyperlink>
+      <w:r>
+        <w:rPr>
+          <w:rFonts w:ascii="Times New Roman" w:eastAsia="Times New Roman" w:hAnsi="Times New Roman" w:cs="Times New Roman"/>
+          <w:sz w:val="24"/>
+          <w:szCs w:val="24"/>
+          <w:lang w:val="pt-PT" w:eastAsia="en-GB"/>
+        </w:rPr>
+        <w:t xml:space="preserve"> .</w:t>
       </w:r>
     </w:p>
     <w:p>
@@ -10646,6 +10665,29 @@
       <w:iCs/>
     </w:rPr>
   </w:style>
+  <w:style w:type="character" w:styleId="Hiperligao">
+    <w:name w:val="Hyperlink"/>
+    <w:basedOn w:val="Tipodeletrapredefinidodopargrafo"/>
+    <w:uiPriority w:val="99"/>
+    <w:unhideWhenUsed/>
+    <w:rsid w:val="002E0E89"/>
+    <w:rPr>
+      <w:color w:val="0563C1" w:themeColor="hyperlink"/>
+      <w:u w:val="single"/>
+    </w:rPr>
+  </w:style>
+  <w:style w:type="character" w:styleId="MenoNoResolvida">
+    <w:name w:val="Unresolved Mention"/>
+    <w:basedOn w:val="Tipodeletrapredefinidodopargrafo"/>
+    <w:uiPriority w:val="99"/>
+    <w:semiHidden/>
+    <w:unhideWhenUsed/>
+    <w:rsid w:val="002E0E89"/>
+    <w:rPr>
+      <w:color w:val="605E5C"/>
+      <w:shd w:val="clear" w:color="auto" w:fill="E1DFDD"/>
+    </w:rPr>
+  </w:style>
 </w:styles>
 </file>
 

</xml_diff>